<commit_message>
Fix glossary gap and quiz-prompt count found in verification pass
Add the missing Evolutionary perspective entry to the A-to-Z glossary and
correct self-test prompt 21 to ask for all five APA/APS/BPS ethics
principles; regenerate the Word and PDF versions.

Co-Authored-By: Claude Fable 5 <noreply@anthropic.com>
Claude-Session: https://claude.ai/code/session_01AkchhwDyNx7DHsLu8RARDU
</commit_message>
<xml_diff>
--- a/assignments/psych-chapter1/03_Key_Terms_Glossary_and_Self_Test.docx
+++ b/assignments/psych-chapter1/03_Key_Terms_Glossary_and_Self_Test.docx
@@ -469,6 +469,24 @@
           <w:bCs/>
           <w:b/>
         </w:rPr>
+        <w:t xml:space="preserve">Evolutionary perspective</w:t>
+      </w:r>
+      <w:r>
+        <w:t xml:space="preserve"> </w:t>
+      </w:r>
+      <w:r>
+        <w:t xml:space="preserve">— An approach that uses knowledge about evolutionary forces, such as natural selection, to understand behavior: thoughts, emotions, and behaviors are shaped because inherited traits increase in frequency when adaptive and decrease when maladaptive. (Based on Darwin’s theory; David Buss is a modern founder.)</w:t>
+      </w:r>
+    </w:p>
+    <w:p>
+      <w:pPr>
+        <w:pStyle w:val="BodyText"/>
+      </w:pPr>
+      <w:r>
+        <w:rPr>
+          <w:bCs/>
+          <w:b/>
+        </w:rPr>
         <w:t xml:space="preserve">Experiment</w:t>
       </w:r>
       <w:r>
@@ -2547,7 +2565,7 @@
         <w:t xml:space="preserve"> </w:t>
       </w:r>
       <w:r>
-        <w:t xml:space="preserve">21. Name four principles the APA/APS/BPS guidelines encourage.</w:t>
+        <w:t xml:space="preserve">21. Name the five principles the APA/APS/BPS guidelines encourage.</w:t>
       </w:r>
       <w:r>
         <w:t xml:space="preserve"> </w:t>

</xml_diff>